<commit_message>
docs: add expected and observed behavior, the video note, and engineering quality to the demo document
Co-Authored-By: Claude Opus 5.5 (1M context) <noreply@anthropic.com>
</commit_message>
<xml_diff>
--- a/docs/Claims-Assistant-Demo.docx
+++ b/docs/Claims-Assistant-Demo.docx
@@ -183,6 +183,17 @@
       </w:r>
       <w:r>
         <w:t>the live demo runs on Render's free plan. After 15 minutes without visitors it sleeps, and the first page load takes about a minute to wake it. Everything after that is normal speed.</w:t>
+      </w:r>
+    </w:p>
+    <w:p>
+      <w:r>
+        <w:rPr>
+          <w:b/>
+        </w:rPr>
+        <w:t xml:space="preserve">About the demo video: </w:t>
+      </w:r>
+      <w:r>
+        <w:t>due to lack of time I was not able to record a video walkthrough. To make up for it, every scenario is reproducible: docs/demo-story.md gives the exact messages to type and what to expect at each step, and scripts/story.py replays the same conversations against the live site and checks 32 expected outcomes automatically in about two minutes. The table under “Expected and observed behavior” below records what those runs showed.</w:t>
       </w:r>
     </w:p>
     <w:p>
@@ -488,6 +499,849 @@
         <w:t>python3 scripts/story.py https://claims-assistant-4wy7.onrender.com</w:t>
       </w:r>
     </w:p>
+    <w:p>
+      <w:pPr>
+        <w:pStyle w:val="Heading1"/>
+      </w:pPr>
+      <w:r>
+        <w:t>Expected and observed behavior</w:t>
+      </w:r>
+    </w:p>
+    <w:p>
+      <w:r>
+        <w:t>Each row is a requirement from the assignment, the behavior it calls for, and what the system actually did when the scenario was run against the real model (gpt-4.1-mini). Every row matched. The same checks are automated in scripts/story.py, which passed all 32 checks on repeated runs.</w:t>
+      </w:r>
+    </w:p>
+    <w:tbl>
+      <w:tblPr>
+        <w:tblStyle w:val="LightGrid-Accent1"/>
+        <w:tblW w:type="auto" w:w="0"/>
+        <w:tblLook w:firstColumn="1" w:firstRow="1" w:lastColumn="0" w:lastRow="0" w:noHBand="0" w:noVBand="1" w:val="04A0"/>
+      </w:tblPr>
+      <w:tblGrid>
+        <w:gridCol w:w="2160"/>
+        <w:gridCol w:w="2160"/>
+        <w:gridCol w:w="2160"/>
+        <w:gridCol w:w="2160"/>
+      </w:tblGrid>
+      <w:tr>
+        <w:tc>
+          <w:tcPr>
+            <w:tcW w:type="dxa" w:w="2160"/>
+          </w:tcPr>
+          <w:p>
+            <w:r/>
+            <w:r>
+              <w:rPr>
+                <w:b/>
+                <w:sz w:val="19"/>
+              </w:rPr>
+              <w:t>Scenario</w:t>
+            </w:r>
+          </w:p>
+        </w:tc>
+        <w:tc>
+          <w:tcPr>
+            <w:tcW w:type="dxa" w:w="2160"/>
+          </w:tcPr>
+          <w:p>
+            <w:r/>
+            <w:r>
+              <w:rPr>
+                <w:b/>
+                <w:sz w:val="19"/>
+              </w:rPr>
+              <w:t>Expected</w:t>
+            </w:r>
+          </w:p>
+        </w:tc>
+        <w:tc>
+          <w:tcPr>
+            <w:tcW w:type="dxa" w:w="2160"/>
+          </w:tcPr>
+          <w:p>
+            <w:r/>
+            <w:r>
+              <w:rPr>
+                <w:b/>
+                <w:sz w:val="19"/>
+              </w:rPr>
+              <w:t>Observed</w:t>
+            </w:r>
+          </w:p>
+        </w:tc>
+        <w:tc>
+          <w:tcPr>
+            <w:tcW w:type="dxa" w:w="2160"/>
+          </w:tcPr>
+          <w:p>
+            <w:r/>
+            <w:r>
+              <w:rPr>
+                <w:b/>
+                <w:sz w:val="19"/>
+              </w:rPr>
+              <w:t>Match</w:t>
+            </w:r>
+          </w:p>
+        </w:tc>
+      </w:tr>
+      <w:tr>
+        <w:tc>
+          <w:tcPr>
+            <w:tcW w:type="dxa" w:w="2160"/>
+          </w:tcPr>
+          <w:p>
+            <w:r/>
+            <w:r>
+              <w:rPr>
+                <w:sz w:val="19"/>
+              </w:rPr>
+              <w:t>Assignment test: Margaret Chen gives name, policy number, DOB, SSN last 4 and “denied healthcare claim from January” in one message</w:t>
+            </w:r>
+          </w:p>
+        </w:tc>
+        <w:tc>
+          <w:tcPr>
+            <w:tcW w:type="dxa" w:w="2160"/>
+          </w:tcPr>
+          <w:p>
+            <w:r/>
+            <w:r>
+              <w:rPr>
+                <w:sz w:val="19"/>
+              </w:rPr>
+              <w:t>Verify; disclose nothing before verification; resolve to claim CL-2048 from the stored hint</w:t>
+            </w:r>
+          </w:p>
+        </w:tc>
+        <w:tc>
+          <w:tcPr>
+            <w:tcW w:type="dxa" w:w="2160"/>
+          </w:tcPr>
+          <w:p>
+            <w:r/>
+            <w:r>
+              <w:rPr>
+                <w:sz w:val="19"/>
+              </w:rPr>
+              <w:t>Verified from name, DOB and SSN last 4 (policy number ignored); went straight to CL-2048 without asking which claim; gave the denial reason, the documents needed and the appeal deadline (March 18, 2026, 17 days away)</w:t>
+            </w:r>
+          </w:p>
+        </w:tc>
+        <w:tc>
+          <w:tcPr>
+            <w:tcW w:type="dxa" w:w="2160"/>
+          </w:tcPr>
+          <w:p>
+            <w:r/>
+            <w:r>
+              <w:rPr>
+                <w:sz w:val="19"/>
+              </w:rPr>
+              <w:t>Yes</w:t>
+            </w:r>
+          </w:p>
+        </w:tc>
+      </w:tr>
+      <w:tr>
+        <w:tc>
+          <w:tcPr>
+            <w:tcW w:type="dxa" w:w="2160"/>
+          </w:tcPr>
+          <w:p>
+            <w:r/>
+            <w:r>
+              <w:rPr>
+                <w:sz w:val="19"/>
+              </w:rPr>
+              <w:t>Partial answers before verification</w:t>
+            </w:r>
+          </w:p>
+        </w:tc>
+        <w:tc>
+          <w:tcPr>
+            <w:tcW w:type="dxa" w:w="2160"/>
+          </w:tcPr>
+          <w:p>
+            <w:r/>
+            <w:r>
+              <w:rPr>
+                <w:sz w:val="19"/>
+              </w:rPr>
+              <w:t>No claim information until 3 fields match; ask for what is missing</w:t>
+            </w:r>
+          </w:p>
+        </w:tc>
+        <w:tc>
+          <w:tcPr>
+            <w:tcW w:type="dxa" w:w="2160"/>
+          </w:tcPr>
+          <w:p>
+            <w:r/>
+            <w:r>
+              <w:rPr>
+                <w:sz w:val="19"/>
+              </w:rPr>
+              <w:t>After the name, and after name and DOB, replies asked for more details and mentioned no claim, amount or date; the panel showed 1 of 3, then 2 of 3</w:t>
+            </w:r>
+          </w:p>
+        </w:tc>
+        <w:tc>
+          <w:tcPr>
+            <w:tcW w:type="dxa" w:w="2160"/>
+          </w:tcPr>
+          <w:p>
+            <w:r/>
+            <w:r>
+              <w:rPr>
+                <w:sz w:val="19"/>
+              </w:rPr>
+              <w:t>Yes</w:t>
+            </w:r>
+          </w:p>
+        </w:tc>
+      </w:tr>
+      <w:tr>
+        <w:tc>
+          <w:tcPr>
+            <w:tcW w:type="dxa" w:w="2160"/>
+          </w:tcPr>
+          <w:p>
+            <w:r/>
+            <w:r>
+              <w:rPr>
+                <w:sz w:val="19"/>
+              </w:rPr>
+              <w:t>Alternate identity field</w:t>
+            </w:r>
+          </w:p>
+        </w:tc>
+        <w:tc>
+          <w:tcPr>
+            <w:tcW w:type="dxa" w:w="2160"/>
+          </w:tcPr>
+          <w:p>
+            <w:r/>
+            <w:r>
+              <w:rPr>
+                <w:sz w:val="19"/>
+              </w:rPr>
+              <w:t>Any 3 of the 5 fields verify, not just the SSN</w:t>
+            </w:r>
+          </w:p>
+        </w:tc>
+        <w:tc>
+          <w:tcPr>
+            <w:tcW w:type="dxa" w:w="2160"/>
+          </w:tcPr>
+          <w:p>
+            <w:r/>
+            <w:r>
+              <w:rPr>
+                <w:sz w:val="19"/>
+              </w:rPr>
+              <w:t>Verified with name, DOB and email, with no SSN</w:t>
+            </w:r>
+          </w:p>
+        </w:tc>
+        <w:tc>
+          <w:tcPr>
+            <w:tcW w:type="dxa" w:w="2160"/>
+          </w:tcPr>
+          <w:p>
+            <w:r/>
+            <w:r>
+              <w:rPr>
+                <w:sz w:val="19"/>
+              </w:rPr>
+              <w:t>Yes</w:t>
+            </w:r>
+          </w:p>
+        </w:tc>
+      </w:tr>
+      <w:tr>
+        <w:tc>
+          <w:tcPr>
+            <w:tcW w:type="dxa" w:w="2160"/>
+          </w:tcPr>
+          <w:p>
+            <w:r/>
+            <w:r>
+              <w:rPr>
+                <w:sz w:val="19"/>
+              </w:rPr>
+              <w:t>Refusal to share the SSN</w:t>
+            </w:r>
+          </w:p>
+        </w:tc>
+        <w:tc>
+          <w:tcPr>
+            <w:tcW w:type="dxa" w:w="2160"/>
+          </w:tcPr>
+          <w:p>
+            <w:r/>
+            <w:r>
+              <w:rPr>
+                <w:sz w:val="19"/>
+              </w:rPr>
+              <w:t>Empathize, explain why verification matters, offer alternatives, then a human</w:t>
+            </w:r>
+          </w:p>
+        </w:tc>
+        <w:tc>
+          <w:tcPr>
+            <w:tcW w:type="dxa" w:w="2160"/>
+          </w:tcPr>
+          <w:p>
+            <w:r/>
+            <w:r>
+              <w:rPr>
+                <w:sz w:val="19"/>
+              </w:rPr>
+              <w:t>Explained that verification protects her claim information and offered DOB, phone or email; a second refusal offered a human</w:t>
+            </w:r>
+          </w:p>
+        </w:tc>
+        <w:tc>
+          <w:tcPr>
+            <w:tcW w:type="dxa" w:w="2160"/>
+          </w:tcPr>
+          <w:p>
+            <w:r/>
+            <w:r>
+              <w:rPr>
+                <w:sz w:val="19"/>
+              </w:rPr>
+              <w:t>Yes</w:t>
+            </w:r>
+          </w:p>
+        </w:tc>
+      </w:tr>
+      <w:tr>
+        <w:tc>
+          <w:tcPr>
+            <w:tcW w:type="dxa" w:w="2160"/>
+          </w:tcPr>
+          <w:p>
+            <w:r/>
+            <w:r>
+              <w:rPr>
+                <w:sz w:val="19"/>
+              </w:rPr>
+              <w:t>Ambiguous date of birth (03/04/1985)</w:t>
+            </w:r>
+          </w:p>
+        </w:tc>
+        <w:tc>
+          <w:tcPr>
+            <w:tcW w:type="dxa" w:w="2160"/>
+          </w:tcPr>
+          <w:p>
+            <w:r/>
+            <w:r>
+              <w:rPr>
+                <w:sz w:val="19"/>
+              </w:rPr>
+              <w:t>Clarify; never guess</w:t>
+            </w:r>
+          </w:p>
+        </w:tc>
+        <w:tc>
+          <w:tcPr>
+            <w:tcW w:type="dxa" w:w="2160"/>
+          </w:tcPr>
+          <w:p>
+            <w:r/>
+            <w:r>
+              <w:rPr>
+                <w:sz w:val="19"/>
+              </w:rPr>
+              <w:t>Asked whether she meant March 4 or April 3, 1985, and did not accept the date until she clarified</w:t>
+            </w:r>
+          </w:p>
+        </w:tc>
+        <w:tc>
+          <w:tcPr>
+            <w:tcW w:type="dxa" w:w="2160"/>
+          </w:tcPr>
+          <w:p>
+            <w:r/>
+            <w:r>
+              <w:rPr>
+                <w:sz w:val="19"/>
+              </w:rPr>
+              <w:t>Yes</w:t>
+            </w:r>
+          </w:p>
+        </w:tc>
+      </w:tr>
+      <w:tr>
+        <w:tc>
+          <w:tcPr>
+            <w:tcW w:type="dxa" w:w="2160"/>
+          </w:tcPr>
+          <w:p>
+            <w:r/>
+            <w:r>
+              <w:rPr>
+                <w:sz w:val="19"/>
+              </w:rPr>
+              <w:t>Wrong SSN three times</w:t>
+            </w:r>
+          </w:p>
+        </w:tc>
+        <w:tc>
+          <w:tcPr>
+            <w:tcW w:type="dxa" w:w="2160"/>
+          </w:tcPr>
+          <w:p>
+            <w:r/>
+            <w:r>
+              <w:rPr>
+                <w:sz w:val="19"/>
+              </w:rPr>
+              <w:t>Say only that verification failed; stop after 3 attempts; never bypass the gate</w:t>
+            </w:r>
+          </w:p>
+        </w:tc>
+        <w:tc>
+          <w:tcPr>
+            <w:tcW w:type="dxa" w:w="2160"/>
+          </w:tcPr>
+          <w:p>
+            <w:r/>
+            <w:r>
+              <w:rPr>
+                <w:sz w:val="19"/>
+              </w:rPr>
+              <w:t>“Couldn't verify” without naming the wrong detail; attempts counted 1, 2, 3; then a human was requested, and even the correct SSN no longer verified</w:t>
+            </w:r>
+          </w:p>
+        </w:tc>
+        <w:tc>
+          <w:tcPr>
+            <w:tcW w:type="dxa" w:w="2160"/>
+          </w:tcPr>
+          <w:p>
+            <w:r/>
+            <w:r>
+              <w:rPr>
+                <w:sz w:val="19"/>
+              </w:rPr>
+              <w:t>Yes</w:t>
+            </w:r>
+          </w:p>
+        </w:tc>
+      </w:tr>
+      <w:tr>
+        <w:tc>
+          <w:tcPr>
+            <w:tcW w:type="dxa" w:w="2160"/>
+          </w:tcPr>
+          <w:p>
+            <w:r/>
+            <w:r>
+              <w:rPr>
+                <w:sz w:val="19"/>
+              </w:rPr>
+              <w:t>National ID entered as an SSN (Ma Tian)</w:t>
+            </w:r>
+          </w:p>
+        </w:tc>
+        <w:tc>
+          <w:tcPr>
+            <w:tcW w:type="dxa" w:w="2160"/>
+          </w:tcPr>
+          <w:p>
+            <w:r/>
+            <w:r>
+              <w:rPr>
+                <w:sz w:val="19"/>
+              </w:rPr>
+              <w:t>A national ID never counts as an SSN</w:t>
+            </w:r>
+          </w:p>
+        </w:tc>
+        <w:tc>
+          <w:tcPr>
+            <w:tcW w:type="dxa" w:w="2160"/>
+          </w:tcPr>
+          <w:p>
+            <w:r/>
+            <w:r>
+              <w:rPr>
+                <w:sz w:val="19"/>
+              </w:rPr>
+              <w:t>Not verified with 6688 as SSN; verified with name, DOB and phone, showing only her own claim CL-3001</w:t>
+            </w:r>
+          </w:p>
+        </w:tc>
+        <w:tc>
+          <w:tcPr>
+            <w:tcW w:type="dxa" w:w="2160"/>
+          </w:tcPr>
+          <w:p>
+            <w:r/>
+            <w:r>
+              <w:rPr>
+                <w:sz w:val="19"/>
+              </w:rPr>
+              <w:t>Yes</w:t>
+            </w:r>
+          </w:p>
+        </w:tc>
+      </w:tr>
+      <w:tr>
+        <w:tc>
+          <w:tcPr>
+            <w:tcW w:type="dxa" w:w="2160"/>
+          </w:tcPr>
+          <w:p>
+            <w:r/>
+            <w:r>
+              <w:rPr>
+                <w:sz w:val="19"/>
+              </w:rPr>
+              <w:t>Another customer's claim (CL-3001 asked by Margaret)</w:t>
+            </w:r>
+          </w:p>
+        </w:tc>
+        <w:tc>
+          <w:tcPr>
+            <w:tcW w:type="dxa" w:w="2160"/>
+          </w:tcPr>
+          <w:p>
+            <w:r/>
+            <w:r>
+              <w:rPr>
+                <w:sz w:val="19"/>
+              </w:rPr>
+              <w:t>Only the caller's own claims; answers only from claim data</w:t>
+            </w:r>
+          </w:p>
+        </w:tc>
+        <w:tc>
+          <w:tcPr>
+            <w:tcW w:type="dxa" w:w="2160"/>
+          </w:tcPr>
+          <w:p>
+            <w:r/>
+            <w:r>
+              <w:rPr>
+                <w:sz w:val="19"/>
+              </w:rPr>
+              <w:t>“I don't see any claim CL-3001 on your account” — identical to a missing claim — and listed only her four claims</w:t>
+            </w:r>
+          </w:p>
+        </w:tc>
+        <w:tc>
+          <w:tcPr>
+            <w:tcW w:type="dxa" w:w="2160"/>
+          </w:tcPr>
+          <w:p>
+            <w:r/>
+            <w:r>
+              <w:rPr>
+                <w:sz w:val="19"/>
+              </w:rPr>
+              <w:t>Yes</w:t>
+            </w:r>
+          </w:p>
+        </w:tc>
+      </w:tr>
+      <w:tr>
+        <w:tc>
+          <w:tcPr>
+            <w:tcW w:type="dxa" w:w="2160"/>
+          </w:tcPr>
+          <w:p>
+            <w:r/>
+            <w:r>
+              <w:rPr>
+                <w:sz w:val="19"/>
+              </w:rPr>
+              <w:t>Messy language</w:t>
+            </w:r>
+          </w:p>
+        </w:tc>
+        <w:tc>
+          <w:tcPr>
+            <w:tcW w:type="dxa" w:w="2160"/>
+          </w:tcPr>
+          <w:p>
+            <w:r/>
+            <w:r>
+              <w:rPr>
+                <w:sz w:val="19"/>
+              </w:rPr>
+              <w:t>Interpret freely, answer only from claim data and approved guidance</w:t>
+            </w:r>
+          </w:p>
+        </w:tc>
+        <w:tc>
+          <w:tcPr>
+            <w:tcW w:type="dxa" w:w="2160"/>
+          </w:tcPr>
+          <w:p>
+            <w:r/>
+            <w:r>
+              <w:rPr>
+                <w:sz w:val="19"/>
+              </w:rPr>
+              <w:t>“ok what about my car claim” switched to CL-2102; “how long does it take after I send stuff” got the approved processing-time guidance</w:t>
+            </w:r>
+          </w:p>
+        </w:tc>
+        <w:tc>
+          <w:tcPr>
+            <w:tcW w:type="dxa" w:w="2160"/>
+          </w:tcPr>
+          <w:p>
+            <w:r/>
+            <w:r>
+              <w:rPr>
+                <w:sz w:val="19"/>
+              </w:rPr>
+              <w:t>Yes</w:t>
+            </w:r>
+          </w:p>
+        </w:tc>
+      </w:tr>
+      <w:tr>
+        <w:tc>
+          <w:tcPr>
+            <w:tcW w:type="dxa" w:w="2160"/>
+          </w:tcPr>
+          <w:p>
+            <w:r/>
+            <w:r>
+              <w:rPr>
+                <w:sz w:val="19"/>
+              </w:rPr>
+              <w:t>Frustration</w:t>
+            </w:r>
+          </w:p>
+        </w:tc>
+        <w:tc>
+          <w:tcPr>
+            <w:tcW w:type="dxa" w:w="2160"/>
+          </w:tcPr>
+          <w:p>
+            <w:r/>
+            <w:r>
+              <w:rPr>
+                <w:sz w:val="19"/>
+              </w:rPr>
+              <w:t>Empathize first</w:t>
+            </w:r>
+          </w:p>
+        </w:tc>
+        <w:tc>
+          <w:tcPr>
+            <w:tcW w:type="dxa" w:w="2160"/>
+          </w:tcPr>
+          <w:p>
+            <w:r/>
+            <w:r>
+              <w:rPr>
+                <w:sz w:val="19"/>
+              </w:rPr>
+              <w:t>“I understand this is frustrating, Margaret”, then the approved guidance for a document she can't get</w:t>
+            </w:r>
+          </w:p>
+        </w:tc>
+        <w:tc>
+          <w:tcPr>
+            <w:tcW w:type="dxa" w:w="2160"/>
+          </w:tcPr>
+          <w:p>
+            <w:r/>
+            <w:r>
+              <w:rPr>
+                <w:sz w:val="19"/>
+              </w:rPr>
+              <w:t>Yes</w:t>
+            </w:r>
+          </w:p>
+        </w:tc>
+      </w:tr>
+      <w:tr>
+        <w:tc>
+          <w:tcPr>
+            <w:tcW w:type="dxa" w:w="2160"/>
+          </w:tcPr>
+          <w:p>
+            <w:r/>
+            <w:r>
+              <w:rPr>
+                <w:sz w:val="19"/>
+              </w:rPr>
+              <w:t>Out-of-scope questions (“What is RL?”) repeated</w:t>
+            </w:r>
+          </w:p>
+        </w:tc>
+        <w:tc>
+          <w:tcPr>
+            <w:tcW w:type="dxa" w:w="2160"/>
+          </w:tcPr>
+          <w:p>
+            <w:r/>
+            <w:r>
+              <w:rPr>
+                <w:sz w:val="19"/>
+              </w:rPr>
+              <w:t>Decline politely; after repeated attempts, offer a human</w:t>
+            </w:r>
+          </w:p>
+        </w:tc>
+        <w:tc>
+          <w:tcPr>
+            <w:tcW w:type="dxa" w:w="2160"/>
+          </w:tcPr>
+          <w:p>
+            <w:r/>
+            <w:r>
+              <w:rPr>
+                <w:sz w:val="19"/>
+              </w:rPr>
+              <w:t>Declined; the second time offered a human; the third time requested a human representative (simulated)</w:t>
+            </w:r>
+          </w:p>
+        </w:tc>
+        <w:tc>
+          <w:tcPr>
+            <w:tcW w:type="dxa" w:w="2160"/>
+          </w:tcPr>
+          <w:p>
+            <w:r/>
+            <w:r>
+              <w:rPr>
+                <w:sz w:val="19"/>
+              </w:rPr>
+              <w:t>Yes</w:t>
+            </w:r>
+          </w:p>
+        </w:tc>
+      </w:tr>
+      <w:tr>
+        <w:tc>
+          <w:tcPr>
+            <w:tcW w:type="dxa" w:w="2160"/>
+          </w:tcPr>
+          <w:p>
+            <w:r/>
+            <w:r>
+              <w:rPr>
+                <w:sz w:val="19"/>
+              </w:rPr>
+              <w:t>Email summary</w:t>
+            </w:r>
+          </w:p>
+        </w:tc>
+        <w:tc>
+          <w:tcPr>
+            <w:tcW w:type="dxa" w:w="2160"/>
+          </w:tcPr>
+          <w:p>
+            <w:r/>
+            <w:r>
+              <w:rPr>
+                <w:sz w:val="19"/>
+              </w:rPr>
+              <w:t>Summary of the discussion, claim status or outcome and next steps; the caller chooses send or skip</w:t>
+            </w:r>
+          </w:p>
+        </w:tc>
+        <w:tc>
+          <w:tcPr>
+            <w:tcW w:type="dxa" w:w="2160"/>
+          </w:tcPr>
+          <w:p>
+            <w:r/>
+            <w:r>
+              <w:rPr>
+                <w:sz w:val="19"/>
+              </w:rPr>
+              <w:t>Preview showed topics, status, reason, documents, deadline and next steps to the masked address; Send delivered it once (Mailpit inbox locally); Skip sent nothing</w:t>
+            </w:r>
+          </w:p>
+        </w:tc>
+        <w:tc>
+          <w:tcPr>
+            <w:tcW w:type="dxa" w:w="2160"/>
+          </w:tcPr>
+          <w:p>
+            <w:r/>
+            <w:r>
+              <w:rPr>
+                <w:sz w:val="19"/>
+              </w:rPr>
+              <w:t>Yes</w:t>
+            </w:r>
+          </w:p>
+        </w:tc>
+      </w:tr>
+      <w:tr>
+        <w:tc>
+          <w:tcPr>
+            <w:tcW w:type="dxa" w:w="2160"/>
+          </w:tcPr>
+          <w:p>
+            <w:r/>
+            <w:r>
+              <w:rPr>
+                <w:sz w:val="19"/>
+              </w:rPr>
+              <w:t>UI and setup</w:t>
+            </w:r>
+          </w:p>
+        </w:tc>
+        <w:tc>
+          <w:tcPr>
+            <w:tcW w:type="dxa" w:w="2160"/>
+          </w:tcPr>
+          <w:p>
+            <w:r/>
+            <w:r>
+              <w:rPr>
+                <w:sz w:val="19"/>
+              </w:rPr>
+              <w:t>A simple chat UI showing all four phases; setup accepts an API token</w:t>
+            </w:r>
+          </w:p>
+        </w:tc>
+        <w:tc>
+          <w:tcPr>
+            <w:tcW w:type="dxa" w:w="2160"/>
+          </w:tcPr>
+          <w:p>
+            <w:r/>
+            <w:r>
+              <w:rPr>
+                <w:sz w:val="19"/>
+              </w:rPr>
+              <w:t>Four-phase stepper and session panel; OPENAI_API_KEY or ANTHROPIC_API_KEY via .env or a Render secret</w:t>
+            </w:r>
+          </w:p>
+        </w:tc>
+        <w:tc>
+          <w:tcPr>
+            <w:tcW w:type="dxa" w:w="2160"/>
+          </w:tcPr>
+          <w:p>
+            <w:r/>
+            <w:r>
+              <w:rPr>
+                <w:sz w:val="19"/>
+              </w:rPr>
+              <w:t>Yes</w:t>
+            </w:r>
+          </w:p>
+        </w:tc>
+      </w:tr>
+    </w:tbl>
+    <w:p/>
     <w:p>
       <w:pPr>
         <w:pStyle w:val="Heading1"/>
@@ -1634,7 +2488,90 @@
         <w:t>Tests:</w:t>
       </w:r>
       <w:r>
-        <w:t xml:space="preserve"> 301 automated tests (offline, deterministic), 6 live-model scenario tests, and the 32-check end-to-end story; CI runs on every push and publishes the Docker image.</w:t>
+        <w:t xml:space="preserve"> 306 automated tests (offline, deterministic), 6 live-model scenario tests, and the 32-check end-to-end story; CI runs on every push and publishes the Docker image.</w:t>
+      </w:r>
+    </w:p>
+    <w:p>
+      <w:pPr>
+        <w:pStyle w:val="Heading1"/>
+      </w:pPr>
+      <w:r>
+        <w:t>Engineering quality</w:t>
+      </w:r>
+    </w:p>
+    <w:p>
+      <w:r>
+        <w:t>The code is complete, and every claim in this document can be checked in the repository:</w:t>
+      </w:r>
+    </w:p>
+    <w:p>
+      <w:pPr>
+        <w:pStyle w:val="ListBullet"/>
+      </w:pPr>
+      <w:r>
+        <w:rPr>
+          <w:b/>
+        </w:rPr>
+        <w:t>Typed end to end.</w:t>
+      </w:r>
+      <w:r>
+        <w:t xml:space="preserve"> Python 3.13 with strict Pydantic contracts for every fixture file and Pydantic validation of every model output; TypeScript in strict mode for the UI.</w:t>
+      </w:r>
+    </w:p>
+    <w:p>
+      <w:pPr>
+        <w:pStyle w:val="ListBullet"/>
+      </w:pPr>
+      <w:r>
+        <w:rPr>
+          <w:b/>
+        </w:rPr>
+        <w:t>Tested at three levels.</w:t>
+      </w:r>
+      <w:r>
+        <w:t xml:space="preserve"> 306 deterministic tests that run in about 2 seconds without a model, 6 scenario tests against the real model, and the 32-check end-to-end story; mutation checks confirmed the key tests fail when the rule they guard is removed.</w:t>
+      </w:r>
+    </w:p>
+    <w:p>
+      <w:pPr>
+        <w:pStyle w:val="ListBullet"/>
+      </w:pPr>
+      <w:r>
+        <w:rPr>
+          <w:b/>
+        </w:rPr>
+        <w:t>Reviewed.</w:t>
+      </w:r>
+      <w:r>
+        <w:t xml:space="preserve"> Every Milestone 1 task went through a specification review and a code-quality review; a dedicated security review of the verification and consent rules found one real issue (a double click could send the summary twice), which was fixed with a regression test.</w:t>
+      </w:r>
+    </w:p>
+    <w:p>
+      <w:pPr>
+        <w:pStyle w:val="ListBullet"/>
+      </w:pPr>
+      <w:r>
+        <w:rPr>
+          <w:b/>
+        </w:rPr>
+        <w:t>Rehearsed against the real model.</w:t>
+      </w:r>
+      <w:r>
+        <w:t xml:space="preserve"> Every demo line was run live before being documented; the issues that surfaced (a model reformatting a date, reading a name out of an email address) were fixed in code and covered by tests.</w:t>
+      </w:r>
+    </w:p>
+    <w:p>
+      <w:pPr>
+        <w:pStyle w:val="ListBullet"/>
+      </w:pPr>
+      <w:r>
+        <w:rPr>
+          <w:b/>
+        </w:rPr>
+        <w:t>Current stack.</w:t>
+      </w:r>
+      <w:r>
+        <w:t xml:space="preserve"> FastAPI, React with TypeScript, OpenAI or Claude as interchangeable providers, Docker images published by GitHub Actions, and a Render deployment defined as code.</w:t>
       </w:r>
     </w:p>
     <w:p>

</xml_diff>